<commit_message>
Added The Workflow + All Requirements
</commit_message>
<xml_diff>
--- a/docs/Guidelines.docx
+++ b/docs/Guidelines.docx
@@ -666,8 +666,17 @@
         <w:rPr>
           <w:b/>
           <w:bCs/>
+          <w:highlight w:val="green"/>
         </w:rPr>
         <w:t>1. Executive Summary &amp; Context</w:t>
+      </w:r>
+      <w:r>
+        <w:rPr>
+          <w:b/>
+          <w:bCs/>
+          <w:highlight w:val="green"/>
+        </w:rPr>
+        <w:t xml:space="preserve"> Done</w:t>
       </w:r>
     </w:p>
     <w:p>
@@ -686,8 +695,17 @@
         <w:rPr>
           <w:b/>
           <w:bCs/>
+          <w:highlight w:val="green"/>
         </w:rPr>
         <w:t>2. Problem Formulation &amp; Current Workflow</w:t>
+      </w:r>
+      <w:r>
+        <w:rPr>
+          <w:b/>
+          <w:bCs/>
+          <w:highlight w:val="green"/>
+        </w:rPr>
+        <w:t xml:space="preserve"> Done</w:t>
       </w:r>
     </w:p>
     <w:p>
@@ -706,8 +724,24 @@
         <w:rPr>
           <w:b/>
           <w:bCs/>
+          <w:highlight w:val="green"/>
         </w:rPr>
         <w:t>3. Solution Landscape (Mandatory Table 1)</w:t>
+      </w:r>
+      <w:r>
+        <w:rPr>
+          <w:b/>
+          <w:bCs/>
+          <w:highlight w:val="green"/>
+        </w:rPr>
+        <w:t>. Done</w:t>
+      </w:r>
+      <w:r>
+        <w:rPr>
+          <w:b/>
+          <w:bCs/>
+        </w:rPr>
+        <w:t xml:space="preserve"> </w:t>
       </w:r>
     </w:p>
     <w:p>
@@ -734,6 +768,7 @@
         <w:rPr>
           <w:b/>
           <w:bCs/>
+          <w:highlight w:val="green"/>
         </w:rPr>
         <w:t>4. Research &amp; Technical Basis (Mandatory Table 2)</w:t>
       </w:r>
@@ -762,6 +797,7 @@
         <w:rPr>
           <w:b/>
           <w:bCs/>
+          <w:highlight w:val="green"/>
         </w:rPr>
         <w:t>5. Complex Computing Problem (CCP) Justification</w:t>
       </w:r>
@@ -853,6 +889,7 @@
         <w:rPr>
           <w:b/>
           <w:bCs/>
+          <w:highlight w:val="green"/>
         </w:rPr>
         <w:t>8. Proposal-Stage Proof of Concept (POC) Evidence</w:t>
       </w:r>
@@ -886,8 +923,35 @@
         <w:rPr>
           <w:b/>
           <w:bCs/>
-        </w:rPr>
-        <w:t>9. Requirements &amp; Evaluation Plan</w:t>
+          <w:highlight w:val="yellow"/>
+        </w:rPr>
+        <w:t xml:space="preserve">9. Requirements &amp; Evaluation </w:t>
+      </w:r>
+      <w:proofErr w:type="gramStart"/>
+      <w:r>
+        <w:rPr>
+          <w:b/>
+          <w:bCs/>
+          <w:highlight w:val="yellow"/>
+        </w:rPr>
+        <w:t>Plan</w:t>
+      </w:r>
+      <w:r>
+        <w:rPr>
+          <w:b/>
+          <w:bCs/>
+          <w:highlight w:val="yellow"/>
+        </w:rPr>
+        <w:t xml:space="preserve">  Working</w:t>
+      </w:r>
+      <w:proofErr w:type="gramEnd"/>
+      <w:r>
+        <w:rPr>
+          <w:b/>
+          <w:bCs/>
+          <w:highlight w:val="yellow"/>
+        </w:rPr>
+        <w:t xml:space="preserve"> on it</w:t>
       </w:r>
     </w:p>
     <w:p>
@@ -1022,6 +1086,7 @@
         <w:rPr>
           <w:b/>
           <w:bCs/>
+          <w:highlight w:val="yellow"/>
         </w:rPr>
         <w:t>10. Scope, Risks &amp; Dependencies</w:t>
       </w:r>
@@ -1064,6 +1129,7 @@
         <w:rPr>
           <w:b/>
           <w:bCs/>
+          <w:highlight w:val="yellow"/>
         </w:rPr>
         <w:t>11. Team Responsibilities</w:t>
       </w:r>
@@ -1076,7 +1142,24 @@
         </w:numPr>
       </w:pPr>
       <w:r>
-        <w:t xml:space="preserve">A breakdown proving that both members have interdependent, heavy engineering roles that pass the "Drop Test". </w:t>
+        <w:t xml:space="preserve">A breakdown proving that </w:t>
+      </w:r>
+      <w:r>
+        <w:t xml:space="preserve">all three </w:t>
+      </w:r>
+      <w:r>
+        <w:t xml:space="preserve">members have interdependent, heavy engineering roles that pass the "Drop Test". </w:t>
+      </w:r>
+      <w:r>
+        <w:t xml:space="preserve">And </w:t>
+      </w:r>
+      <w:proofErr w:type="gramStart"/>
+      <w:r>
+        <w:t>also</w:t>
+      </w:r>
+      <w:proofErr w:type="gramEnd"/>
+      <w:r>
+        <w:t xml:space="preserve"> the work distribution as well</w:t>
       </w:r>
     </w:p>
     <w:p>
@@ -4102,6 +4185,7 @@
   <w:style w:type="character" w:default="1" w:styleId="DefaultParagraphFont">
     <w:name w:val="Default Paragraph Font"/>
     <w:uiPriority w:val="1"/>
+    <w:semiHidden/>
     <w:unhideWhenUsed/>
   </w:style>
   <w:style w:type="table" w:default="1" w:styleId="TableNormal">

</xml_diff>

<commit_message>
Made changes to the draft And Complete Reqs Draft 1 Ready for Compilation
</commit_message>
<xml_diff>
--- a/docs/Guidelines.docx
+++ b/docs/Guidelines.docx
@@ -889,7 +889,7 @@
         <w:rPr>
           <w:b/>
           <w:bCs/>
-          <w:highlight w:val="green"/>
+          <w:highlight w:val="red"/>
         </w:rPr>
         <w:t>8. Proposal-Stage Proof of Concept (POC) Evidence</w:t>
       </w:r>
@@ -923,7 +923,7 @@
         <w:rPr>
           <w:b/>
           <w:bCs/>
-          <w:highlight w:val="yellow"/>
+          <w:highlight w:val="green"/>
         </w:rPr>
         <w:t xml:space="preserve">9. Requirements &amp; Evaluation </w:t>
       </w:r>
@@ -932,7 +932,7 @@
         <w:rPr>
           <w:b/>
           <w:bCs/>
-          <w:highlight w:val="yellow"/>
+          <w:highlight w:val="green"/>
         </w:rPr>
         <w:t>Plan</w:t>
       </w:r>
@@ -940,7 +940,7 @@
         <w:rPr>
           <w:b/>
           <w:bCs/>
-          <w:highlight w:val="yellow"/>
+          <w:highlight w:val="green"/>
         </w:rPr>
         <w:t xml:space="preserve">  Working</w:t>
       </w:r>
@@ -949,7 +949,7 @@
         <w:rPr>
           <w:b/>
           <w:bCs/>
-          <w:highlight w:val="yellow"/>
+          <w:highlight w:val="green"/>
         </w:rPr>
         <w:t xml:space="preserve"> on it</w:t>
       </w:r>
@@ -1086,7 +1086,7 @@
         <w:rPr>
           <w:b/>
           <w:bCs/>
-          <w:highlight w:val="yellow"/>
+          <w:highlight w:val="green"/>
         </w:rPr>
         <w:t>10. Scope, Risks &amp; Dependencies</w:t>
       </w:r>

</xml_diff>